<commit_message>
Bind gold by pinned bytes, drop the redundant S3 results box, label actual tokens
An uploaded copy of a corpus PDF is the same bytes as the pinned document,
so the audited fixture's company and fiscal year are authoritative — a
filename-derived identity no longer detaches the gold, and only a
mismatched output currency (non-comparable numbers) blocks scoring.
Strategy 3 loses its selected-page results card (history covers it), and
the input-tokens cell reads 'actual tokens' with proper spacing.
</commit_message>
<xml_diff>
--- a/docs/バクラク事業部技術_実験報告書_完成版_改訂.docx
+++ b/docs/バクラク事業部技術_実験報告書_完成版_改訂.docx
@@ -1837,7 +1837,7 @@
           <wp:inline distT="0" distB="0" distL="0" distR="0" wp14:anchorId="79CB3821" wp14:editId="04353EA8">
             <wp:extent cx="5897880" cy="3317558"/>
             <wp:effectExtent l="0" t="0" r="0" b="0"/>
-            <wp:docPr id="2" name="Picture 2" descr="全文入力、文字認識、Active RAGを検討し、決定論的な完全ページ選択を採用した。"/>
+            <wp:docPr id="2" name="Picture 2" descr="全文入力、文字認識、アクティブRAGを検討し、決定論的な完全ページ選択を採用した。" title="全文入力、文字認識、アクティブRAGを検討し、決定論的な完全ページ選択を採用した。"/>
             <wp:cNvGraphicFramePr>
               <a:graphicFrameLocks xmlns:a="http://schemas.openxmlformats.org/drawingml/2006/main" noChangeAspect="1"/>
             </wp:cNvGraphicFramePr>
@@ -7439,7 +7439,7 @@
           <wp:inline distT="0" distB="0" distL="0" distR="0" wp14:anchorId="71EF2138" wp14:editId="7DDA5927">
             <wp:extent cx="5897880" cy="3317558"/>
             <wp:effectExtent l="0" t="0" r="0" b="0"/>
-            <wp:docPr id="4" name="Picture 4" descr="GLM-5.3思考モードで三戦略すべてが完了した同一75資料のP50処理時間から算出した。モデル間ではなく、入力戦略だけを比較する。"/>
+            <wp:docPr id="4" name="Picture 4" descr="Gemini 3.7 Flash・中程度の同一75資料で三戦略の処理速度を比較する。" title="Gemini 3.7 Flash・中程度の同一75資料で三戦略の処理速度を比較する。"/>
             <wp:cNvGraphicFramePr>
               <a:graphicFrameLocks xmlns:a="http://schemas.openxmlformats.org/drawingml/2006/main" noChangeAspect="1"/>
             </wp:cNvGraphicFramePr>
@@ -7507,7 +7507,7 @@
           <wp:inline distT="0" distB="0" distL="0" distR="0" wp14:anchorId="3C9B1817" wp14:editId="24F80BFD">
             <wp:extent cx="5897880" cy="3317558"/>
             <wp:effectExtent l="0" t="0" r="0" b="0"/>
-            <wp:docPr id="5" name="Picture 5" descr="図4と同じ75資料における1資料当たりの平均である。初回抽出、契約修復、根拠再試行の報告入力トークンを合算した。戦略三は戦略一に対して90.1%削減した。"/>
+            <wp:docPr id="5" name="Picture 5" descr="Gemini 3.7 Flash・中程度の同一75資料で三戦略の全呼出し入力トークン数を比較する。" title="Gemini 3.7 Flash・中程度の同一75資料で三戦略の全呼出し入力トークン数を比較する。"/>
             <wp:cNvGraphicFramePr>
               <a:graphicFrameLocks xmlns:a="http://schemas.openxmlformats.org/drawingml/2006/main" noChangeAspect="1"/>
             </wp:cNvGraphicFramePr>

</xml_diff>